<commit_message>
Rename chapter 1 draft and polish article text
</commit_message>
<xml_diff>
--- a/article/chapter05.docx
+++ b/article/chapter05.docx
@@ -49,7 +49,7 @@
         <w:rPr>
           <w:rFonts w:hint="eastAsia"/>
         </w:rPr>
-        <w:t xml:space="preserve">的随机动力学节点，以承担时序处理任务。三者共用第二章提供的器件模型与同一仿真后端，差别仅在于上层如何使用器件的随机性。伊辛求解以全阵列同步演化至热平衡的方式利用随机性逃逸局部极小，PBNN以独立同分布的Bernoulli采样并在时域平均的方式把随机性归约为确定期望，本章则保留磁矩在时间上的相关性，并把这种相关性本身当作计算资源。由此，同一物理阵列承担传统分离任务的主线，从优化与前馈推断两类扩展到含记忆的时序处理；更重要的是，被前两类任务所利用的是器件的瞬时或平衡态随机性，本章利用的则是其时域动力学，即把可用的物理资源从瞬时涨落延伸到弛豫记忆。</w:t>
+        <w:t xml:space="preserve">的随机动力学节点，以承担时序处理任务。三者共用第二章提供的器件模型与同一仿真后端，差别仅在于上层如何使用器件的随机性。伊辛求解以全阵列异步Gibbs演化至热平衡的方式利用随机性逃逸局部极小，PBNN以独立同分布的Bernoulli采样并在时域平均的方式把随机性归约为确定期望，本章则保留磁矩在时间上的相关性，并把这种相关性本身当作计算资源。由此，同一物理阵列承担传统分离任务的主线，从优化与前馈推断两类扩展到含记忆的时序处理；更重要的是，被前两类任务所利用的是器件的瞬时或平衡态随机性，本章利用的则是其时域动力学，即把可用的物理资源从瞬时涨落延伸到弛豫记忆。</w:t>
       </w:r>
     </w:p>
     <w:p>
@@ -5231,33 +5231,7 @@
         <w:rPr>
           <w:rFonts w:hint="eastAsia"/>
         </w:rPr>
-        <w:t xml:space="preserve">、1000步推理下，sMTJ-RC约</w:t>
-      </w:r>
-      <m:oMath>
-        <m:r>
-          <m:t>338</m:t>
-        </m:r>
-        <m:r>
-          <m:t> </m:t>
-        </m:r>
-        <m:r>
-          <m:rPr>
-            <m:sty m:val="p"/>
-          </m:rPr>
-          <m:t>n</m:t>
-        </m:r>
-        <m:r>
-          <m:rPr>
-            <m:sty m:val="p"/>
-          </m:rPr>
-          <m:t>J</m:t>
-        </m:r>
-      </m:oMath>
-      <w:r>
-        <w:rPr>
-          <w:rFonts w:hint="eastAsia"/>
-        </w:rPr>
-        <w:t xml:space="preserve">，其读出能量以提取的sky130</w:t>
+        <w:t xml:space="preserve">、1000步推理下，sMTJ-RC的读出能量以提取的sky130</w:t>
       </w:r>
       <w:r>
         <w:t xml:space="preserve"> </w:t>
@@ -5278,93 +5252,16 @@
         <w:rPr>
           <w:rFonts w:hint="eastAsia"/>
         </w:rPr>
-        <w:t xml:space="preserve">；较常规数字ESN</w:t>
-      </w:r>
-      <w:r>
-        <w:t xml:space="preserve"> </w:t>
-      </w:r>
-      <w:r>
-        <w:rPr>
-          <w:rFonts w:hint="eastAsia"/>
-        </w:rPr>
-        <w:t xml:space="preserve">(约</w:t>
-      </w:r>
-      <m:oMath>
-        <m:r>
-          <m:t>10</m:t>
-        </m:r>
-        <m:r>
-          <m:t> </m:t>
-        </m:r>
-        <m:r>
-          <m:t>204</m:t>
-        </m:r>
-        <m:r>
-          <m:t> </m:t>
-        </m:r>
-        <m:r>
-          <m:rPr>
-            <m:sty m:val="p"/>
-          </m:rPr>
-          <m:t>n</m:t>
-        </m:r>
-        <m:r>
-          <m:rPr>
-            <m:sty m:val="p"/>
-          </m:rPr>
-          <m:t>J</m:t>
-        </m:r>
-      </m:oMath>
-      <w:r>
-        <w:rPr>
-          <w:rFonts w:hint="eastAsia"/>
-        </w:rPr>
-        <w:t xml:space="preserve">，按1</w:t>
-      </w:r>
-      <w:r>
-        <w:t xml:space="preserve"> </w:t>
-      </w:r>
-      <w:r>
-        <w:rPr>
-          <w:rFonts w:hint="eastAsia"/>
-        </w:rPr>
-        <w:t xml:space="preserve">pJ每次乘加计)</w:t>
-      </w:r>
-      <w:r>
-        <w:t xml:space="preserve"> </w:t>
-      </w:r>
-      <w:r>
-        <w:rPr>
-          <w:rFonts w:hint="eastAsia"/>
-        </w:rPr>
-        <w:t xml:space="preserve">低约30倍</w:t>
-      </w:r>
-      <w:r>
-        <w:t xml:space="preserve"> </w:t>
-      </w:r>
-      <w:r>
-        <w:rPr>
-          <w:rFonts w:hint="eastAsia"/>
-        </w:rPr>
-        <w:t xml:space="preserve">(逐节点8位读出；改用列共享时分复用读出约35倍)，按单位记忆容量能耗计低约一个数量级</w:t>
-      </w:r>
-      <w:r>
-        <w:t xml:space="preserve"> </w:t>
-      </w:r>
-      <w:r>
-        <w:rPr>
-          <w:rFonts w:hint="eastAsia"/>
-        </w:rPr>
-        <w:t xml:space="preserve">(231对2140</w:t>
-      </w:r>
-      <w:r>
-        <w:t xml:space="preserve"> </w:t>
-      </w:r>
-      <w:r>
-        <w:rPr>
-          <w:rFonts w:hint="eastAsia"/>
-        </w:rPr>
-        <w:t xml:space="preserve">nJ)。又因</w:t>
+        <w:t xml:space="preserve">，其单次推理能量较常规数字ESN低约30倍</w:t>
+      </w:r>
+      <w:r>
+        <w:t xml:space="preserve"> </w:t>
+      </w:r>
+      <w:r>
+        <w:rPr>
+          <w:rFonts w:hint="eastAsia"/>
+        </w:rPr>
+        <w:t xml:space="preserve">(逐节点8位读出；改用列共享时分复用读出约35倍)，按单位记忆容量能耗计更低约一个数量级。又因</w:t>
       </w:r>
       <m:oMath>
         <m:r>

</xml_diff>

<commit_message>
Sync .docx manually; add build_docx.py (watcher retired per user)
- scripts/build_docx.py: pypandoc recipe (fold inline $$..$$, strip image alts, markdown-implicit_figures), validated by reproducing the committed chapter05.docx to zero content diff modulo post-watcher .md polish
- chapter04.docx: carries the Table 4.6 fix + sensitivity envelope; chapter05.docx: was stale against the fc6770b/12c7ffa prose polish, now synced
- watcher wording cleaned from .agents docs and execution queue; user decisions recorded (tornado figure stays repo-level; hikstor_data footnote verified against IEDM full text - A7 closed)

Co-Authored-By: Claude Fable 5 <noreply@anthropic.com>
</commit_message>
<xml_diff>
--- a/article/chapter05.docx
+++ b/article/chapter05.docx
@@ -165,7 +165,7 @@
         <w:t xml:space="preserve">所描述的一次性、无记忆写事件。RC所依赖的恰是被PBNN平均掉的那部分信息：一个固定而不训练的高维非线性动力学系统，具备衰减记忆，使当前状态依赖近期输入历史而渐忘远期，仅训练末端的线性读出层即可完成时序映射。超顺磁sMTJ的热涨落翻转过程本身即为一个具有可调时间常数的有状态系统，因而能够承担这一角色。本章在验证sMTJ器件能否以可机理归因的方式承担这一范式的基础上，集中回答两个面向工程的问题：该用法的硬件能效相对数字储备池居于何种水平，以及面向RC优化的sMTJ应落在怎样的器件参数区间。</w:t>
       </w:r>
     </w:p>
-    <w:bookmarkStart w:id="12" w:name="X2c3693f1ea629acbd3653c39f4b741f2e98fe49"/>
+    <w:bookmarkStart w:id="12" w:name="smtj-rc的硬件工作原理"/>
     <w:p>
       <w:pPr>
         <w:pStyle w:val="Heading2"/>
@@ -200,12 +200,12 @@
           <wp:inline>
             <wp:extent cx="5334000" cy="3772401"/>
             <wp:effectExtent b="0" l="0" r="0" t="0"/>
-            <wp:docPr descr="" title="fig:" id="10" name="Picture"/>
+            <wp:docPr descr="" title="" id="10" name="Picture"/>
             <a:graphic>
               <a:graphicData uri="http://schemas.openxmlformats.org/drawingml/2006/picture">
                 <pic:pic>
                   <pic:nvPicPr>
-                    <pic:cNvPr descr="D:\Documents\Graduation%20Project-2026\04PBNNSim\smtj_pbnn_sim\article\figs\Chapter05_local_01.png" id="11" name="Picture"/>
+                    <pic:cNvPr descr="figs/Chapter05_local_01.png" id="11" name="Picture"/>
                     <pic:cNvPicPr>
                       <a:picLocks noChangeArrowheads="1" noChangeAspect="1"/>
                     </pic:cNvPicPr>
@@ -1488,7 +1488,7 @@
       </w:r>
     </w:p>
     <w:bookmarkEnd w:id="12"/>
-    <w:bookmarkStart w:id="32" w:name="X8b4cbb38f556b06001e24393be160f126df2dc6"/>
+    <w:bookmarkStart w:id="32" w:name="既有储备池工作与本章定位"/>
     <w:p>
       <w:pPr>
         <w:pStyle w:val="Heading2"/>
@@ -1682,7 +1682,7 @@
       </w:r>
     </w:p>
     <w:bookmarkEnd w:id="32"/>
-    <w:bookmarkStart w:id="36" w:name="X0fced55f049d481e37f9e7e33488642b087f1d9"/>
+    <w:bookmarkStart w:id="36" w:name="仿真器扩展与原型验证"/>
     <w:p>
       <w:pPr>
         <w:pStyle w:val="Heading2"/>
@@ -2594,12 +2594,12 @@
           <wp:inline>
             <wp:extent cx="5334000" cy="2999208"/>
             <wp:effectExtent b="0" l="0" r="0" t="0"/>
-            <wp:docPr descr="" title="fig:" id="34" name="Picture"/>
+            <wp:docPr descr="" title="" id="34" name="Picture"/>
             <a:graphic>
               <a:graphicData uri="http://schemas.openxmlformats.org/drawingml/2006/picture">
                 <pic:pic>
                   <pic:nvPicPr>
-                    <pic:cNvPr descr="D:\Documents\Graduation%20Project-2026\04PBNNSim\smtj_pbnn_sim\article\figs\Chapter05_local_02.png" id="35" name="Picture"/>
+                    <pic:cNvPr descr="figs/Chapter05_local_02.png" id="35" name="Picture"/>
                     <pic:cNvPicPr>
                       <a:picLocks noChangeArrowheads="1" noChangeAspect="1"/>
                     </pic:cNvPicPr>
@@ -3059,7 +3059,7 @@
       </w:r>
     </w:p>
     <w:bookmarkEnd w:id="36"/>
-    <w:bookmarkStart w:id="46" w:name="Xfc4c0f5761aae0ec08aa8c785bce0c5dd705a0d"/>
+    <w:bookmarkStart w:id="46" w:name="面向rc的器件优化与变异分析"/>
     <w:p>
       <w:pPr>
         <w:pStyle w:val="Heading2"/>
@@ -3161,12 +3161,12 @@
           <wp:inline>
             <wp:extent cx="5334000" cy="3820702"/>
             <wp:effectExtent b="0" l="0" r="0" t="0"/>
-            <wp:docPr descr="" title="fig:" id="38" name="Picture"/>
+            <wp:docPr descr="" title="" id="38" name="Picture"/>
             <a:graphic>
               <a:graphicData uri="http://schemas.openxmlformats.org/drawingml/2006/picture">
                 <pic:pic>
                   <pic:nvPicPr>
-                    <pic:cNvPr descr="D:\Documents\Graduation%20Project-2026\04PBNNSim\smtj_pbnn_sim\article\figs\Chapter05_local_03.png" id="39" name="Picture"/>
+                    <pic:cNvPr descr="figs/Chapter05_local_03.png" id="39" name="Picture"/>
                     <pic:cNvPicPr>
                       <a:picLocks noChangeArrowheads="1" noChangeAspect="1"/>
                     </pic:cNvPicPr>
@@ -3924,12 +3924,12 @@
           <wp:inline>
             <wp:extent cx="5334000" cy="3820990"/>
             <wp:effectExtent b="0" l="0" r="0" t="0"/>
-            <wp:docPr descr="" title="fig:" id="41" name="Picture"/>
+            <wp:docPr descr="" title="" id="41" name="Picture"/>
             <a:graphic>
               <a:graphicData uri="http://schemas.openxmlformats.org/drawingml/2006/picture">
                 <pic:pic>
                   <pic:nvPicPr>
-                    <pic:cNvPr descr="D:\Documents\Graduation%20Project-2026\04PBNNSim\smtj_pbnn_sim\article\figs\Chapter05_local_04.png" id="42" name="Picture"/>
+                    <pic:cNvPr descr="figs/Chapter05_local_04.png" id="42" name="Picture"/>
                     <pic:cNvPicPr>
                       <a:picLocks noChangeArrowheads="1" noChangeAspect="1"/>
                     </pic:cNvPicPr>
@@ -4328,12 +4328,12 @@
           <wp:inline>
             <wp:extent cx="5334000" cy="3811218"/>
             <wp:effectExtent b="0" l="0" r="0" t="0"/>
-            <wp:docPr descr="" title="fig:" id="44" name="Picture"/>
+            <wp:docPr descr="" title="" id="44" name="Picture"/>
             <a:graphic>
               <a:graphicData uri="http://schemas.openxmlformats.org/drawingml/2006/picture">
                 <pic:pic>
                   <pic:nvPicPr>
-                    <pic:cNvPr descr="D:\Documents\Graduation%20Project-2026\04PBNNSim\smtj_pbnn_sim\article\figs\Chapter05_local_05.png" id="45" name="Picture"/>
+                    <pic:cNvPr descr="figs/Chapter05_local_05.png" id="45" name="Picture"/>
                     <pic:cNvPicPr>
                       <a:picLocks noChangeArrowheads="1" noChangeAspect="1"/>
                     </pic:cNvPicPr>
@@ -4663,7 +4663,7 @@
       </w:r>
     </w:p>
     <w:bookmarkEnd w:id="46"/>
-    <w:bookmarkStart w:id="63" w:name="Xe2a3f1b1aa575c0cb974114346a118e6d81fbc7"/>
+    <w:bookmarkStart w:id="63" w:name="基准广度与硬件能效"/>
     <w:p>
       <w:pPr>
         <w:pStyle w:val="Heading2"/>
@@ -4698,12 +4698,12 @@
           <wp:inline>
             <wp:extent cx="5334000" cy="3806953"/>
             <wp:effectExtent b="0" l="0" r="0" t="0"/>
-            <wp:docPr descr="" title="fig:" id="48" name="Picture"/>
+            <wp:docPr descr="" title="" id="48" name="Picture"/>
             <a:graphic>
               <a:graphicData uri="http://schemas.openxmlformats.org/drawingml/2006/picture">
                 <pic:pic>
                   <pic:nvPicPr>
-                    <pic:cNvPr descr="D:\Documents\Graduation%20Project-2026\04PBNNSim\smtj_pbnn_sim\article\figs\Chapter05_local_06.png" id="49" name="Picture"/>
+                    <pic:cNvPr descr="figs/Chapter05_local_06.png" id="49" name="Picture"/>
                     <pic:cNvPicPr>
                       <a:picLocks noChangeArrowheads="1" noChangeAspect="1"/>
                     </pic:cNvPicPr>
@@ -4976,12 +4976,12 @@
           <wp:inline>
             <wp:extent cx="5334000" cy="3805731"/>
             <wp:effectExtent b="0" l="0" r="0" t="0"/>
-            <wp:docPr descr="" title="fig:" id="52" name="Picture"/>
+            <wp:docPr descr="" title="" id="52" name="Picture"/>
             <a:graphic>
               <a:graphicData uri="http://schemas.openxmlformats.org/drawingml/2006/picture">
                 <pic:pic>
                   <pic:nvPicPr>
-                    <pic:cNvPr descr="D:\Documents\Graduation%20Project-2026\04PBNNSim\smtj_pbnn_sim\article\figs\Chapter05_local_07.png" id="53" name="Picture"/>
+                    <pic:cNvPr descr="figs/Chapter05_local_07.png" id="53" name="Picture"/>
                     <pic:cNvPicPr>
                       <a:picLocks noChangeArrowheads="1" noChangeAspect="1"/>
                     </pic:cNvPicPr>
@@ -5349,7 +5349,7 @@
         <w:rPr>
           <w:rFonts w:hint="eastAsia"/>
         </w:rPr>
-        <w:t xml:space="preserve">的下界仍低于sMTJ-RC，故该优势成立于相对冯诺依曼式数字ESN的比较，而非相对最激进的模拟存内计算。图5.7(d)</w:t>
+        <w:t xml:space="preserve">的下界仍低于sMTJ-RC，故该优势成立的前提是相对冯诺依曼式数字ESN的比较，而非相对最激进的模拟存内计算。图5.7(d)</w:t>
       </w:r>
       <w:r>
         <w:t xml:space="preserve"> </w:t>
@@ -5447,12 +5447,12 @@
           <wp:inline>
             <wp:extent cx="5334000" cy="2788227"/>
             <wp:effectExtent b="0" l="0" r="0" t="0"/>
-            <wp:docPr descr="" title="fig:" id="58" name="Picture"/>
+            <wp:docPr descr="" title="" id="58" name="Picture"/>
             <a:graphic>
               <a:graphicData uri="http://schemas.openxmlformats.org/drawingml/2006/picture">
                 <pic:pic>
                   <pic:nvPicPr>
-                    <pic:cNvPr descr="D:\Documents\Graduation%20Project-2026\04PBNNSim\smtj_pbnn_sim\article\figs\Chapter05_local_08.png" id="59" name="Picture"/>
+                    <pic:cNvPr descr="figs/Chapter05_local_08.png" id="59" name="Picture"/>
                     <pic:cNvPicPr>
                       <a:picLocks noChangeArrowheads="1" noChangeAspect="1"/>
                     </pic:cNvPicPr>
@@ -5534,12 +5534,12 @@
           <wp:inline>
             <wp:extent cx="5334000" cy="1822410"/>
             <wp:effectExtent b="0" l="0" r="0" t="0"/>
-            <wp:docPr descr="" title="fig:" id="61" name="Picture"/>
+            <wp:docPr descr="" title="" id="61" name="Picture"/>
             <a:graphic>
               <a:graphicData uri="http://schemas.openxmlformats.org/drawingml/2006/picture">
                 <pic:pic>
                   <pic:nvPicPr>
-                    <pic:cNvPr descr="D:\Documents\Graduation%20Project-2026\04PBNNSim\smtj_pbnn_sim\article\figs\Chapter05_local_09.png" id="62" name="Picture"/>
+                    <pic:cNvPr descr="figs/Chapter05_local_09.png" id="62" name="Picture"/>
                     <pic:cNvPicPr>
                       <a:picLocks noChangeArrowheads="1" noChangeAspect="1"/>
                     </pic:cNvPicPr>
@@ -5699,7 +5699,7 @@
       </w:r>
     </w:p>
     <w:bookmarkEnd w:id="63"/>
-    <w:bookmarkStart w:id="71" w:name="Xcaaba4a8071824c394fe34912acc8d64f805d47"/>
+    <w:bookmarkStart w:id="71" w:name="本章小结"/>
     <w:p>
       <w:pPr>
         <w:pStyle w:val="Heading2"/>
@@ -5835,7 +5835,7 @@
         <w:rPr>
           <w:rFonts w:hint="eastAsia"/>
         </w:rPr>
-        <w:t xml:space="preserve">下充分探索，这关系到sMTJ-RC能否在更广场景胜过数字基线。其二，递归耦合在本章以数值矩阵实现，其物理形态</w:t>
+        <w:t xml:space="preserve">下充分探索，这关系到sMTJ-RC能否在更广的场景下胜过数字基线。其二，递归耦合在本章以数值矩阵实现，其物理形态</w:t>
       </w:r>
       <w:r>
         <w:t xml:space="preserve"> </w:t>
@@ -6076,12 +6076,12 @@
           <wp:inline>
             <wp:extent cx="5334000" cy="2611235"/>
             <wp:effectExtent b="0" l="0" r="0" t="0"/>
-            <wp:docPr descr="" title="fig:" id="69" name="Picture"/>
+            <wp:docPr descr="" title="" id="69" name="Picture"/>
             <a:graphic>
               <a:graphicData uri="http://schemas.openxmlformats.org/drawingml/2006/picture">
                 <pic:pic>
                   <pic:nvPicPr>
-                    <pic:cNvPr descr="D:\Documents\Graduation%20Project-2026\04PBNNSim\smtj_pbnn_sim\article\figs\Chapter05_local_10.png" id="70" name="Picture"/>
+                    <pic:cNvPr descr="figs/Chapter05_local_10.png" id="70" name="Picture"/>
                     <pic:cNvPicPr>
                       <a:picLocks noChangeArrowheads="1" noChangeAspect="1"/>
                     </pic:cNvPicPr>

</xml_diff>

<commit_message>
Demote internal trial-and-error narration from body prose to footnotes
- ch4 4.5: peripheral-three provenance clause dropped from body (te_read footnote already carries it); 4.6 dual-model paragraph states the LLG slope gap directly, with the field-like SOT integration erratum history moved to a new llg_errata footnote
- ch5 5.5: the readout-cost-model contradiction narrative moved out of the energy co-design paragraph into a new ro_costmodel footnote; "no longer treated as free" wording replaced by a plain statement of what is billed
- both .docx regenerated

Co-Authored-By: Claude Fable 5 <noreply@anthropic.com>
</commit_message>
<xml_diff>
--- a/article/chapter05.docx
+++ b/article/chapter05.docx
@@ -2,7 +2,7 @@
 <file path=word/document.xml><?xml version="1.0" encoding="utf-8"?>
 <w:document xmlns:w="http://schemas.openxmlformats.org/wordprocessingml/2006/main" xmlns:m="http://schemas.openxmlformats.org/officeDocument/2006/math" xmlns:r="http://schemas.openxmlformats.org/officeDocument/2006/relationships" xmlns:o="urn:schemas-microsoft-com:office:office" xmlns:v="urn:schemas-microsoft-com:vml" xmlns:w10="urn:schemas-microsoft-com:office:word" xmlns:a="http://schemas.openxmlformats.org/drawingml/2006/main" xmlns:pic="http://schemas.openxmlformats.org/drawingml/2006/picture" xmlns:wp="http://schemas.openxmlformats.org/drawingml/2006/wordprocessingDrawing">
   <w:body>
-    <w:bookmarkStart w:id="70" w:name="第5章-基于smtj的储备池计算硬件评估与器件优化指导"/>
+    <w:bookmarkStart w:id="71" w:name="第5章-基于smtj的储备池计算硬件评估与器件优化指导"/>
     <w:p>
       <w:pPr>
         <w:pStyle w:val="Heading1"/>
@@ -4643,7 +4643,7 @@
       </w:r>
     </w:p>
     <w:bookmarkEnd w:id="46"/>
-    <w:bookmarkStart w:id="63" w:name="基准广度与硬件能效"/>
+    <w:bookmarkStart w:id="64" w:name="基准广度与硬件能效"/>
     <w:p>
       <w:pPr>
         <w:pStyle w:val="Heading2"/>
@@ -5329,31 +5329,43 @@
         <w:rPr>
           <w:rFonts w:hint="eastAsia"/>
         </w:rPr>
-        <w:t xml:space="preserve">上述能量对比把读出连同模数转换计入，其底层是一处值得单独说明的协同设计。原储备池能量模型把读出视为近乎无代价，而读出精度实为记忆容量的限制者，二者矛盾。把模数转换能量以提取的sky130</w:t>
-      </w:r>
-      <w:r>
-        <w:t xml:space="preserve"> </w:t>
-      </w:r>
-      <w:r>
-        <w:rPr>
-          <w:rFonts w:hint="eastAsia"/>
-        </w:rPr>
-        <w:t xml:space="preserve">StrongARM比较器作逐次逼近转换器的比较器项、电容数模阵列的开关能量以sky130单位电容标定后，读出确非无代价：比较器即使3位分辨也已占储备池总能量近九成</w:t>
-      </w:r>
-      <w:r>
-        <w:t xml:space="preserve"> </w:t>
-      </w:r>
-      <w:r>
-        <w:rPr>
-          <w:rFonts w:hint="eastAsia"/>
-        </w:rPr>
-        <w:t xml:space="preserve">(图5.9)；但比较器项随位数线性增长，故分辨率的能量惩罚温和。对集成式储备池而言低至中等分辨读出即足这一结论本身在近期工作中已有报道</w:t>
+        <w:t xml:space="preserve">上述能量对比把读出连同模数转换计入，其底层是读出与阵列的协同设计</w:t>
       </w:r>
       <w:r>
         <w:rPr>
           <w:rStyle w:val="FootnoteReference"/>
         </w:rPr>
         <w:footnoteReference w:id="55"/>
+      </w:r>
+      <w:r>
+        <w:rPr>
+          <w:rFonts w:hint="eastAsia"/>
+        </w:rPr>
+        <w:t xml:space="preserve">。把模数转换能量以提取的sky130</w:t>
+      </w:r>
+      <w:r>
+        <w:t xml:space="preserve"> </w:t>
+      </w:r>
+      <w:r>
+        <w:rPr>
+          <w:rFonts w:hint="eastAsia"/>
+        </w:rPr>
+        <w:t xml:space="preserve">StrongARM比较器作逐次逼近转换器的比较器项、电容数模阵列的开关能量以sky130单位电容标定后，读出主导储备池能量：比较器即使3位分辨也已占总能量近九成</w:t>
+      </w:r>
+      <w:r>
+        <w:t xml:space="preserve"> </w:t>
+      </w:r>
+      <w:r>
+        <w:rPr>
+          <w:rFonts w:hint="eastAsia"/>
+        </w:rPr>
+        <w:t xml:space="preserve">(图5.9)；但比较器项随位数线性增长，分辨率的能量惩罚温和。对集成式储备池而言低至中等分辨读出即足这一结论本身在近期工作中已有报道</w:t>
+      </w:r>
+      <w:r>
+        <w:rPr>
+          <w:rStyle w:val="FootnoteReference"/>
+        </w:rPr>
+        <w:footnoteReference w:id="56"/>
       </w:r>
       <w:r>
         <w:rPr>
@@ -5407,18 +5419,18 @@
           <wp:inline>
             <wp:extent cx="5334000" cy="2788227"/>
             <wp:effectExtent b="0" l="0" r="0" t="0"/>
-            <wp:docPr descr="" title="" id="58" name="Picture"/>
+            <wp:docPr descr="" title="" id="59" name="Picture"/>
             <a:graphic>
               <a:graphicData uri="http://schemas.openxmlformats.org/drawingml/2006/picture">
                 <pic:pic>
                   <pic:nvPicPr>
-                    <pic:cNvPr descr="figs/Chapter05_local_08.png" id="59" name="Picture"/>
+                    <pic:cNvPr descr="figs/Chapter05_local_08.png" id="60" name="Picture"/>
                     <pic:cNvPicPr>
                       <a:picLocks noChangeArrowheads="1" noChangeAspect="1"/>
                     </pic:cNvPicPr>
                   </pic:nvPicPr>
                   <pic:blipFill>
-                    <a:blip r:embed="rId57"/>
+                    <a:blip r:embed="rId58"/>
                     <a:stretch>
                       <a:fillRect/>
                     </a:stretch>
@@ -5494,18 +5506,18 @@
           <wp:inline>
             <wp:extent cx="5334000" cy="1822410"/>
             <wp:effectExtent b="0" l="0" r="0" t="0"/>
-            <wp:docPr descr="" title="" id="61" name="Picture"/>
+            <wp:docPr descr="" title="" id="62" name="Picture"/>
             <a:graphic>
               <a:graphicData uri="http://schemas.openxmlformats.org/drawingml/2006/picture">
                 <pic:pic>
                   <pic:nvPicPr>
-                    <pic:cNvPr descr="figs/Chapter05_local_09.png" id="62" name="Picture"/>
+                    <pic:cNvPr descr="figs/Chapter05_local_09.png" id="63" name="Picture"/>
                     <pic:cNvPicPr>
                       <a:picLocks noChangeArrowheads="1" noChangeAspect="1"/>
                     </pic:cNvPicPr>
                   </pic:nvPicPr>
                   <pic:blipFill>
-                    <a:blip r:embed="rId60"/>
+                    <a:blip r:embed="rId61"/>
                     <a:stretch>
                       <a:fillRect/>
                     </a:stretch>
@@ -5658,8 +5670,8 @@
         <w:t xml:space="preserve">fJ)，而按位线性的比较器项主导总能量，印证读出能量杠杆在于跨列摊销比较器而非削减位数。各备选方案与同流程分析见附录D。</w:t>
       </w:r>
     </w:p>
-    <w:bookmarkEnd w:id="63"/>
-    <w:bookmarkStart w:id="68" w:name="本章小结"/>
+    <w:bookmarkEnd w:id="64"/>
+    <w:bookmarkStart w:id="69" w:name="本章小结"/>
     <w:p>
       <w:pPr>
         <w:pStyle w:val="Heading2"/>
@@ -5688,7 +5700,7 @@
         <w:rPr>
           <w:rStyle w:val="FootnoteReference"/>
         </w:rPr>
-        <w:footnoteReference w:id="64"/>
+        <w:footnoteReference w:id="65"/>
       </w:r>
       <w:r>
         <w:rPr>
@@ -5789,18 +5801,18 @@
           <wp:inline>
             <wp:extent cx="5334000" cy="2611235"/>
             <wp:effectExtent b="0" l="0" r="0" t="0"/>
-            <wp:docPr descr="" title="" id="66" name="Picture"/>
+            <wp:docPr descr="" title="" id="67" name="Picture"/>
             <a:graphic>
               <a:graphicData uri="http://schemas.openxmlformats.org/drawingml/2006/picture">
                 <pic:pic>
                   <pic:nvPicPr>
-                    <pic:cNvPr descr="figs/Chapter05_local_10.png" id="67" name="Picture"/>
+                    <pic:cNvPr descr="figs/Chapter05_local_10.png" id="68" name="Picture"/>
                     <pic:cNvPicPr>
                       <a:picLocks noChangeArrowheads="1" noChangeAspect="1"/>
                     </pic:cNvPicPr>
                   </pic:nvPicPr>
                   <pic:blipFill>
-                    <a:blip r:embed="rId65"/>
+                    <a:blip r:embed="rId66"/>
                     <a:stretch>
                       <a:fillRect/>
                     </a:stretch>
@@ -5905,8 +5917,8 @@
         <w:t xml:space="preserve">从主线层面看，本章与第三、四章共同构成同一物理阵列承担三类传统分离任务的完整证据：第三章的组合优化、第四章的前馈推断、本章的时序处理，三者在器件层、阵列层与仿真后端层均无硬件分歧，差别只在外围调度。优化以全阵列同步演化进行，推断以按层有序前馈采样进行，时序处理则以保留时间相关的连续演化进行。前两类任务利用的是器件的瞬时随机性，本章进一步把可用资源延伸到器件的时域动力学，在任务覆盖之外也拓宽了概率计算所依托的物理基础。第四章结论曾指出，概率计算有望从由算法适配器件特性的阶段，推进到由器件按算法需求加以定制的阶段；本章关于RC偏好更低势垒、并按任务时标匹配弛豫时间的定量结论，正是这一设想在时序处理任务上的具体实现。下一章在此基础上对全文工作作出总结并讨论后续研究方向。</w:t>
       </w:r>
     </w:p>
-    <w:bookmarkEnd w:id="68"/>
-    <w:bookmarkStart w:id="69" w:name="参考文献"/>
+    <w:bookmarkEnd w:id="69"/>
+    <w:bookmarkStart w:id="70" w:name="参考文献"/>
     <w:p>
       <w:pPr>
         <w:pStyle w:val="Heading2"/>
@@ -5918,8 +5930,8 @@
         <w:t xml:space="preserve">参考文献</w:t>
       </w:r>
     </w:p>
-    <w:bookmarkEnd w:id="69"/>
     <w:bookmarkEnd w:id="70"/>
+    <w:bookmarkEnd w:id="71"/>
     <w:sectPr>
       <w:footnotePr>
         <w:numRestart w:val="eachSect"/>
@@ -6505,6 +6517,28 @@
         <w:t xml:space="preserve"> </w:t>
       </w:r>
       <w:r>
+        <w:rPr>
+          <w:rFonts w:hint="eastAsia"/>
+        </w:rPr>
+        <w:t xml:space="preserve">此处记录一次口径订正：储备池能量模型的早期版本把读出计为近乎无代价的整数乘加项，与读出精度实为记忆容量限制者的结论相矛盾；以提取参数重标定后，读出被确认为主导项，本节结论均按订正后的口径给出。</w:t>
+      </w:r>
+    </w:p>
+  </w:footnote>
+  <w:footnote w:id="56">
+    <w:p>
+      <w:pPr>
+        <w:pStyle w:val="FootnoteText"/>
+      </w:pPr>
+      <w:r>
+        <w:rPr>
+          <w:rStyle w:val="FootnoteReference"/>
+        </w:rPr>
+        <w:footnoteRef/>
+      </w:r>
+      <w:r>
+        <w:t xml:space="preserve"> </w:t>
+      </w:r>
+      <w:r>
         <w:t xml:space="preserve">Nakamura Y, Kubota T, Imai Y, Tsunegi S, Notsu H, Nakajima K. Ensemble reservoir computing for physical systems.</w:t>
       </w:r>
       <w:r>
@@ -6523,7 +6557,7 @@
       <w:r>
         <w:t xml:space="preserve"> </w:t>
       </w:r>
-      <w:hyperlink r:id="rId56">
+      <w:hyperlink r:id="rId57">
         <w:r>
           <w:rPr>
             <w:rStyle w:val="Hyperlink"/>
@@ -6533,7 +6567,7 @@
       </w:hyperlink>
     </w:p>
   </w:footnote>
-  <w:footnote w:id="64">
+  <w:footnote w:id="65">
     <w:p>
       <w:pPr>
         <w:pStyle w:val="FootnoteText"/>

</xml_diff>

<commit_message>
Fix remaining history wording in ch5 5.5 (billed plainly, not "no longer free")
Co-Authored-By: Claude Fable 5 <noreply@anthropic.com>
</commit_message>
<xml_diff>
--- a/article/chapter05.docx
+++ b/article/chapter05.docx
@@ -5191,16 +5191,16 @@
         <w:rPr>
           <w:rFonts w:hint="eastAsia"/>
         </w:rPr>
-        <w:t xml:space="preserve">、1000步推理下，sMTJ-RC的读出能量以提取的sky130</w:t>
-      </w:r>
-      <w:r>
-        <w:t xml:space="preserve"> </w:t>
-      </w:r>
-      <w:r>
-        <w:rPr>
-          <w:rFonts w:hint="eastAsia"/>
-        </w:rPr>
-        <w:t xml:space="preserve">StrongARM比较器与电容数模阵列标定的逐次逼近转换为准、不再视为无代价</w:t>
+        <w:t xml:space="preserve">、1000步推理下，sMTJ-RC的读出能量按提取的sky130</w:t>
+      </w:r>
+      <w:r>
+        <w:t xml:space="preserve"> </w:t>
+      </w:r>
+      <w:r>
+        <w:rPr>
+          <w:rFonts w:hint="eastAsia"/>
+        </w:rPr>
+        <w:t xml:space="preserve">StrongARM比较器与电容数模阵列标定的逐次逼近转换计入</w:t>
       </w:r>
       <w:r>
         <w:rPr>

</xml_diff>